<commit_message>
Enrich Santander/Miami post with sports + Florida demographic data
Add a "Why the NFL, and why the Dolphins" section (Latinos as the NFL's
fastest-growing fan base; Dolphins' 2026 international watch parties in
Brazil, Spain, Mexico, Argentina, matching Santander's home markets) and
deepen the market case with the Wall Street South capital influx (Citadel,
Blackstone, Goldman; no state income tax; Brickell) and the $4T US Latino
GDP / $4.1T purchasing power. Sourced to NPR, DIRECTV, Miami Dolphins,
InvestmentNews, and the LDC report. No em dashes.

Co-Authored-By: Claude Opus 4.8 <noreply@anthropic.com>
Claude-Session: https://claude.ai/code/session_01WdmaS8fb3WHmxD5MVo6UfL
</commit_message>
<xml_diff>
--- a/blog/Santander-Miami-Dolphins-South-Florida.docx
+++ b/blog/Santander-Miami-Dolphins-South-Florida.docx
@@ -67,7 +67,7 @@
         </w:rPr>
         <w:t xml:space="preserve">On September 24, 2026, Santander announced it is </w:t>
       </w:r>
-      <w:hyperlink w:history="1" r:id="rIdvaycrmuqvh6n43myitym4">
+      <w:hyperlink w:history="1" r:id="rIdk6j6yso13udq5vmiokhr6">
         <w:r>
           <w:rPr>
             <w:rStyle w:val="Hyperlink"/>
@@ -109,48 +109,70 @@
           <w:sz w:val="28"/>
           <w:szCs w:val="28"/>
         </w:rPr>
-        <w:t xml:space="preserve">Why South Florida is the prize</w:t>
-      </w:r>
-    </w:p>
-    <w:p>
-      <w:pPr>
-        <w:spacing w:after="160" w:line="288"/>
-      </w:pPr>
-      <w:r>
-        <w:rPr>
-          <w:sz w:val="22"/>
-          <w:szCs w:val="22"/>
-        </w:rPr>
-        <w:t xml:space="preserve">Miami is not just a large metro. It is the gateway to Latin America, and the demographics make the point. </w:t>
-      </w:r>
-      <w:hyperlink w:history="1" r:id="rId_af43g_tjlgfzgi2dcqjg">
-        <w:r>
-          <w:rPr>
-            <w:rStyle w:val="Hyperlink"/>
-            <w:sz w:val="22"/>
-            <w:szCs w:val="22"/>
-          </w:rPr>
-          <w:t xml:space="preserve">Roughly 70% of Miami-Dade County is Hispanic</w:t>
-        </w:r>
-      </w:hyperlink>
-      <w:r>
-        <w:rPr>
-          <w:sz w:val="22"/>
-          <w:szCs w:val="22"/>
-        </w:rPr>
-        <w:t xml:space="preserve">, more than 1.8 million residents, and about two-thirds of the population speaks Spanish at home. The mix is not monolithic: Cubans, Venezuelans, Colombians, and a large Brazilian community give the market both Spanish and Portuguese speakers, along with the cross-border capital, remittances, and private wealth that flow through the city in both directions. For a bank, South Florida is where US retail, Latin American private banking, and international money movement all converge in one zip code.</w:t>
-      </w:r>
-    </w:p>
-    <w:p>
-      <w:pPr>
-        <w:spacing w:after="160" w:line="288"/>
-      </w:pPr>
-      <w:r>
-        <w:rPr>
-          <w:sz w:val="22"/>
-          <w:szCs w:val="22"/>
-        </w:rPr>
-        <w:t xml:space="preserve">That is why the deal is not really about a videoboard. It is about owning the front door to a market that is, functionally, the capital of Latin America inside the United States.</w:t>
+        <w:t xml:space="preserve">Why the NFL, and why the Dolphins</w:t>
+      </w:r>
+    </w:p>
+    <w:p>
+      <w:pPr>
+        <w:spacing w:after="160" w:line="288"/>
+      </w:pPr>
+      <w:r>
+        <w:rPr>
+          <w:sz w:val="22"/>
+          <w:szCs w:val="22"/>
+        </w:rPr>
+        <w:t xml:space="preserve">The sport is not incidental to the strategy. Latinos are the </w:t>
+      </w:r>
+      <w:hyperlink w:history="1" r:id="rIdt3xaqdmdwa-sk3pwzdmfv">
+        <w:r>
+          <w:rPr>
+            <w:rStyle w:val="Hyperlink"/>
+            <w:sz w:val="22"/>
+            <w:szCs w:val="22"/>
+          </w:rPr>
+          <w:t xml:space="preserve">fastest-growing fan base in the NFL</w:t>
+        </w:r>
+      </w:hyperlink>
+      <w:r>
+        <w:rPr>
+          <w:sz w:val="22"/>
+          <w:szCs w:val="22"/>
+        </w:rPr>
+        <w:t xml:space="preserve">, and </w:t>
+      </w:r>
+      <w:hyperlink w:history="1" r:id="rIde4rbu76lioqrefusrcxvs">
+        <w:r>
+          <w:rPr>
+            <w:rStyle w:val="Hyperlink"/>
+            <w:sz w:val="22"/>
+            <w:szCs w:val="22"/>
+          </w:rPr>
+          <w:t xml:space="preserve">Hispanic viewership and Spanish-language broadcasts have been climbing fast</w:t>
+        </w:r>
+      </w:hyperlink>
+      <w:r>
+        <w:rPr>
+          <w:sz w:val="22"/>
+          <w:szCs w:val="22"/>
+        </w:rPr>
+        <w:t xml:space="preserve"> across the league. The Dolphins in particular are courting exactly the countries where Santander is a household name, opening the 2026 season with </w:t>
+      </w:r>
+      <w:hyperlink w:history="1" r:id="rIdztg4sieq9q9op59ka88n0">
+        <w:r>
+          <w:rPr>
+            <w:rStyle w:val="Hyperlink"/>
+            <w:sz w:val="22"/>
+            <w:szCs w:val="22"/>
+          </w:rPr>
+          <w:t xml:space="preserve">international watch parties in Brazil, Spain, Mexico, and Argentina</w:t>
+        </w:r>
+      </w:hyperlink>
+      <w:r>
+        <w:rPr>
+          <w:sz w:val="22"/>
+          <w:szCs w:val="22"/>
+        </w:rPr>
+        <w:t xml:space="preserve">. The team's own international map and the bank's footprint line up almost perfectly.</w:t>
       </w:r>
     </w:p>
     <w:p>
@@ -165,82 +187,94 @@
           <w:sz w:val="28"/>
           <w:szCs w:val="28"/>
         </w:rPr>
-        <w:t xml:space="preserve">Who owns the brand and the trust?</w:t>
-      </w:r>
-    </w:p>
-    <w:p>
-      <w:pPr>
-        <w:spacing w:after="160" w:line="288"/>
-      </w:pPr>
-      <w:r>
-        <w:rPr>
-          <w:sz w:val="22"/>
-          <w:szCs w:val="22"/>
-        </w:rPr>
-        <w:t xml:space="preserve">Here is Santander's structural edge, and it is one most rivals cannot match. The populations that define Miami are, in large part, from countries where Santander is already a household name. It is a Spanish bank at its root, one of the largest banks in Brazil, a major player in Mexico, and a fixture across Latin America. A Venezuelan, Brazilian, or Spanish customer arriving in Miami is not meeting a new brand. They are meeting a bank they already trust from home. Sport is how Santander converts that latent familiarity into an active US relationship.</w:t>
-      </w:r>
-    </w:p>
-    <w:p>
-      <w:pPr>
-        <w:spacing w:after="160" w:line="288"/>
-      </w:pPr>
-      <w:r>
-        <w:rPr>
-          <w:sz w:val="22"/>
-          <w:szCs w:val="22"/>
-        </w:rPr>
-        <w:t xml:space="preserve">And the sponsorship is only the visible tip of a deep local bet. Santander opened its </w:t>
-      </w:r>
-      <w:hyperlink w:history="1" r:id="rIdqbwhuoponvyhcf6fdzvqh">
-        <w:r>
-          <w:rPr>
-            <w:rStyle w:val="Hyperlink"/>
-            <w:sz w:val="22"/>
-            <w:szCs w:val="22"/>
-          </w:rPr>
-          <w:t xml:space="preserve">first US Openbank location at Miami Worldcenter</w:t>
-        </w:r>
-      </w:hyperlink>
-      <w:r>
-        <w:rPr>
-          <w:sz w:val="22"/>
-          <w:szCs w:val="22"/>
-        </w:rPr>
-        <w:t xml:space="preserve">, broke ground on the </w:t>
-      </w:r>
-      <w:hyperlink w:history="1" r:id="rIdwezdb7jp--xodfxuchet-">
-        <w:r>
-          <w:rPr>
-            <w:rStyle w:val="Hyperlink"/>
-            <w:sz w:val="22"/>
-            <w:szCs w:val="22"/>
-          </w:rPr>
-          <w:t xml:space="preserve">50-story 1401 Brickell tower</w:t>
-        </w:r>
-      </w:hyperlink>
-      <w:r>
-        <w:rPr>
-          <w:sz w:val="22"/>
-          <w:szCs w:val="22"/>
-        </w:rPr>
-        <w:t xml:space="preserve"> in the financial district, and has run a Miami private-banking hub serving the Americas for more than 40 years, part of a regional presence it traces to 1979. It even runs the same Openbank digital brand it </w:t>
-      </w:r>
-      <w:hyperlink w:history="1" r:id="rId19sffjpue8cljtneg9gu-">
-        <w:r>
-          <w:rPr>
-            <w:rStyle w:val="Hyperlink"/>
-            <w:sz w:val="22"/>
-            <w:szCs w:val="22"/>
-          </w:rPr>
-          <w:t xml:space="preserve">just launched in Mexico</w:t>
-        </w:r>
-      </w:hyperlink>
-      <w:r>
-        <w:rPr>
-          <w:sz w:val="22"/>
-          <w:szCs w:val="22"/>
-        </w:rPr>
-        <w:t xml:space="preserve">, turning Miami into a bridge between its US and Latin American franchises. The Dolphins deal also compounds an existing sports position: Santander is the Official Retail Banking Partner of Formula 1, and Hard Rock Stadium is home to the F1 Miami Grand Prix and a 2026 FIFA World Cup venue. One stadium, three global audiences, all disproportionately Latino and international.</w:t>
+        <w:t xml:space="preserve">Why South Florida is the prize</w:t>
+      </w:r>
+    </w:p>
+    <w:p>
+      <w:pPr>
+        <w:spacing w:after="160" w:line="288"/>
+      </w:pPr>
+      <w:r>
+        <w:rPr>
+          <w:sz w:val="22"/>
+          <w:szCs w:val="22"/>
+        </w:rPr>
+        <w:t xml:space="preserve">Miami is not just a large metro. It is the gateway to Latin America, and the demographics make the point. </w:t>
+      </w:r>
+      <w:hyperlink w:history="1" r:id="rIdgjvscpgrsfzf6zv9bh5id">
+        <w:r>
+          <w:rPr>
+            <w:rStyle w:val="Hyperlink"/>
+            <w:sz w:val="22"/>
+            <w:szCs w:val="22"/>
+          </w:rPr>
+          <w:t xml:space="preserve">Roughly 70% of Miami-Dade County is Hispanic</w:t>
+        </w:r>
+      </w:hyperlink>
+      <w:r>
+        <w:rPr>
+          <w:sz w:val="22"/>
+          <w:szCs w:val="22"/>
+        </w:rPr>
+        <w:t xml:space="preserve">, more than 1.8 million residents, and about two-thirds of the population speaks Spanish at home. The mix is not monolithic: Cubans, Venezuelans, Colombians, and a large Brazilian community give the market both Spanish and Portuguese speakers, along with the cross-border capital, remittances, and private wealth that flow through the city in both directions. For a bank, South Florida is where US retail, Latin American private banking, and international money movement all converge in one zip code.</w:t>
+      </w:r>
+    </w:p>
+    <w:p>
+      <w:pPr>
+        <w:spacing w:after="160" w:line="288"/>
+      </w:pPr>
+      <w:r>
+        <w:rPr>
+          <w:sz w:val="22"/>
+          <w:szCs w:val="22"/>
+        </w:rPr>
+        <w:t xml:space="preserve">Two forces amplify the opportunity. First, the money is moving south. Miami has become "Wall Street South," with </w:t>
+      </w:r>
+      <w:hyperlink w:history="1" r:id="rIdqxxf1_45_0zxk2fgigj_7">
+        <w:r>
+          <w:rPr>
+            <w:rStyle w:val="Hyperlink"/>
+            <w:sz w:val="22"/>
+            <w:szCs w:val="22"/>
+          </w:rPr>
+          <w:t xml:space="preserve">Citadel relocating its headquarters and firms like Blackstone and Goldman Sachs expanding their footprint</w:t>
+        </w:r>
+      </w:hyperlink>
+      <w:r>
+        <w:rPr>
+          <w:sz w:val="22"/>
+          <w:szCs w:val="22"/>
+        </w:rPr>
+        <w:t xml:space="preserve">, drawn in part by Florida's lack of a state income, capital-gains, or estate tax. Much of that capital lands in Brickell, the very financial district where Santander is building its 1401 tower. Second, the customer base is not only large but rising fast: the </w:t>
+      </w:r>
+      <w:hyperlink w:history="1" r:id="rIdw371cyuls14fdiudp35vv">
+        <w:r>
+          <w:rPr>
+            <w:rStyle w:val="Hyperlink"/>
+            <w:sz w:val="22"/>
+            <w:szCs w:val="22"/>
+          </w:rPr>
+          <w:t xml:space="preserve">US Latino economy reached roughly $4 trillion in 2025</w:t>
+        </w:r>
+      </w:hyperlink>
+      <w:r>
+        <w:rPr>
+          <w:sz w:val="22"/>
+          <w:szCs w:val="22"/>
+        </w:rPr>
+        <w:t xml:space="preserve">, which would rank as the world's fifth-largest economy on its own, with purchasing power near $4.1 trillion and growth outpacing the rest of the country.</w:t>
+      </w:r>
+    </w:p>
+    <w:p>
+      <w:pPr>
+        <w:spacing w:after="160" w:line="288"/>
+      </w:pPr>
+      <w:r>
+        <w:rPr>
+          <w:sz w:val="22"/>
+          <w:szCs w:val="22"/>
+        </w:rPr>
+        <w:t xml:space="preserve">That is why the deal is not really about a videoboard. It is about owning the front door to a market that is, functionally, the capital of Latin America inside the United States.</w:t>
       </w:r>
     </w:p>
     <w:p>
@@ -255,6 +289,96 @@
           <w:sz w:val="28"/>
           <w:szCs w:val="28"/>
         </w:rPr>
+        <w:t xml:space="preserve">Who owns the brand and the trust?</w:t>
+      </w:r>
+    </w:p>
+    <w:p>
+      <w:pPr>
+        <w:spacing w:after="160" w:line="288"/>
+      </w:pPr>
+      <w:r>
+        <w:rPr>
+          <w:sz w:val="22"/>
+          <w:szCs w:val="22"/>
+        </w:rPr>
+        <w:t xml:space="preserve">Here is Santander's structural edge, and it is one most rivals cannot match. The populations that define Miami are, in large part, from countries where Santander is already a household name. It is a Spanish bank at its root, one of the largest banks in Brazil, a major player in Mexico, and a fixture across Latin America. A Venezuelan, Brazilian, or Spanish customer arriving in Miami is not meeting a new brand. They are meeting a bank they already trust from home. Sport is how Santander converts that latent familiarity into an active US relationship.</w:t>
+      </w:r>
+    </w:p>
+    <w:p>
+      <w:pPr>
+        <w:spacing w:after="160" w:line="288"/>
+      </w:pPr>
+      <w:r>
+        <w:rPr>
+          <w:sz w:val="22"/>
+          <w:szCs w:val="22"/>
+        </w:rPr>
+        <w:t xml:space="preserve">And the sponsorship is only the visible tip of a deep local bet. Santander opened its </w:t>
+      </w:r>
+      <w:hyperlink w:history="1" r:id="rIdohnu3s0uvr3lgtl-kyevf">
+        <w:r>
+          <w:rPr>
+            <w:rStyle w:val="Hyperlink"/>
+            <w:sz w:val="22"/>
+            <w:szCs w:val="22"/>
+          </w:rPr>
+          <w:t xml:space="preserve">first US Openbank location at Miami Worldcenter</w:t>
+        </w:r>
+      </w:hyperlink>
+      <w:r>
+        <w:rPr>
+          <w:sz w:val="22"/>
+          <w:szCs w:val="22"/>
+        </w:rPr>
+        <w:t xml:space="preserve">, broke ground on the </w:t>
+      </w:r>
+      <w:hyperlink w:history="1" r:id="rIdpdrifovx-ydrmz6xdihia">
+        <w:r>
+          <w:rPr>
+            <w:rStyle w:val="Hyperlink"/>
+            <w:sz w:val="22"/>
+            <w:szCs w:val="22"/>
+          </w:rPr>
+          <w:t xml:space="preserve">50-story 1401 Brickell tower</w:t>
+        </w:r>
+      </w:hyperlink>
+      <w:r>
+        <w:rPr>
+          <w:sz w:val="22"/>
+          <w:szCs w:val="22"/>
+        </w:rPr>
+        <w:t xml:space="preserve"> in the financial district, and has run a Miami private-banking hub serving the Americas for more than 40 years, part of a regional presence it traces to 1979. It even runs the same Openbank digital brand it </w:t>
+      </w:r>
+      <w:hyperlink w:history="1" r:id="rIddfom_w0iojuyplmaigtdn">
+        <w:r>
+          <w:rPr>
+            <w:rStyle w:val="Hyperlink"/>
+            <w:sz w:val="22"/>
+            <w:szCs w:val="22"/>
+          </w:rPr>
+          <w:t xml:space="preserve">just launched in Mexico</w:t>
+        </w:r>
+      </w:hyperlink>
+      <w:r>
+        <w:rPr>
+          <w:sz w:val="22"/>
+          <w:szCs w:val="22"/>
+        </w:rPr>
+        <w:t xml:space="preserve">, turning Miami into a bridge between its US and Latin American franchises. The Dolphins deal also compounds an existing sports position: Santander is the Official Retail Banking Partner of Formula 1, and Hard Rock Stadium is home to the F1 Miami Grand Prix and a 2026 FIFA World Cup venue. One stadium, three global audiences, all disproportionately Latino and international.</w:t>
+      </w:r>
+    </w:p>
+    <w:p>
+      <w:pPr>
+        <w:spacing w:after="120" w:before="280"/>
+      </w:pPr>
+      <w:r>
+        <w:rPr>
+          <w:b/>
+          <w:bCs/>
+          <w:color w:val="4B3FBF"/>
+          <w:sz w:val="28"/>
+          <w:szCs w:val="28"/>
+        </w:rPr>
         <w:t xml:space="preserve">The pattern, and the catch</w:t>
       </w:r>
     </w:p>
@@ -327,7 +451,7 @@
         </w:rPr>
         <w:t xml:space="preserve"> </w:t>
       </w:r>
-      <w:hyperlink w:history="1" r:id="rIdb9tcly52oy40vjv7jwi2f">
+      <w:hyperlink w:history="1" r:id="rIdpaa0mosrqwc2rlq61nyyr">
         <w:r>
           <w:rPr>
             <w:rStyle w:val="Hyperlink"/>
@@ -344,7 +468,7 @@
         </w:rPr>
         <w:t xml:space="preserve"> and </w:t>
       </w:r>
-      <w:hyperlink w:history="1" r:id="rIdjeq2mbii5yv8sexpy0tc6">
+      <w:hyperlink w:history="1" r:id="rIdbg5cwkydplpmbqd7vydws">
         <w:r>
           <w:rPr>
             <w:rStyle w:val="Hyperlink"/>
@@ -420,7 +544,7 @@
         </w:rPr>
         <w:t xml:space="preserve">Santander Bank Partners with Miami Dolphins and Hard Rock Stadium as It Expands Its South Florida Presence (Sep 24, 2026): </w:t>
       </w:r>
-      <w:hyperlink w:history="1" r:id="rIdvg9vjyebhicxprebez90j">
+      <w:hyperlink w:history="1" r:id="rIdv8t3wxwn-dup3qz5mbipm">
         <w:r>
           <w:rPr>
             <w:rStyle w:val="Hyperlink"/>
@@ -437,7 +561,7 @@
         </w:rPr>
         <w:t xml:space="preserve"> · </w:t>
       </w:r>
-      <w:hyperlink w:history="1" r:id="rIdralm3mcctly35hmq-dsby">
+      <w:hyperlink w:history="1" r:id="rIdyd8syp7nverxupnqbu_re">
         <w:r>
           <w:rPr>
             <w:rStyle w:val="Hyperlink"/>
@@ -464,7 +588,7 @@
         </w:rPr>
         <w:t xml:space="preserve">Santander Introduces First Openbank Location in the United States at Miami Worldcenter (May 2025): </w:t>
       </w:r>
-      <w:hyperlink w:history="1" r:id="rIdetfvkykf7kjlues9mklfr">
+      <w:hyperlink w:history="1" r:id="rIdk6xt2aylmn4-vhdac4jio">
         <w:r>
           <w:rPr>
             <w:rStyle w:val="Hyperlink"/>
@@ -491,7 +615,7 @@
         </w:rPr>
         <w:t xml:space="preserve">Santander Celebrates Groundbreaking of 1401 Brickell in Miami and Continued U.S. Growth: </w:t>
       </w:r>
-      <w:hyperlink w:history="1" r:id="rId-umwmdoyos85nwzmfjo1d">
+      <w:hyperlink w:history="1" r:id="rIdl7wcasmnisqqoilbvkz-v">
         <w:r>
           <w:rPr>
             <w:rStyle w:val="Hyperlink"/>
@@ -518,7 +642,7 @@
         </w:rPr>
         <w:t xml:space="preserve">Openbank launches in Mexico (Feb 2025): </w:t>
       </w:r>
-      <w:hyperlink w:history="1" r:id="rId0dd1nrxggsza8nsoodp9k">
+      <w:hyperlink w:history="1" r:id="rId3wveplhght9hqzukyl7yn">
         <w:r>
           <w:rPr>
             <w:rStyle w:val="Hyperlink"/>
@@ -545,7 +669,7 @@
         </w:rPr>
         <w:t xml:space="preserve">Miami as a global-first market and gateway to Latin America (~70% Hispanic): </w:t>
       </w:r>
-      <w:hyperlink w:history="1" r:id="rIdwf5j1aqtj55ivijese0iw">
+      <w:hyperlink w:history="1" r:id="rId8_7mdiplpuqd7p5-7-ep-">
         <w:r>
           <w:rPr>
             <w:rStyle w:val="Hyperlink"/>
@@ -562,7 +686,7 @@
         </w:rPr>
         <w:t xml:space="preserve"> · </w:t>
       </w:r>
-      <w:hyperlink w:history="1" r:id="rIdpj8vbu_alnlel3bpbwhxg">
+      <w:hyperlink w:history="1" r:id="rId7v70fiswchg23sleii1sa">
         <w:r>
           <w:rPr>
             <w:rStyle w:val="Hyperlink"/>
@@ -570,6 +694,131 @@
             <w:szCs w:val="22"/>
           </w:rPr>
           <w:t xml:space="preserve">Demographics of Miami</w:t>
+        </w:r>
+      </w:hyperlink>
+    </w:p>
+    <w:p>
+      <w:pPr>
+        <w:pStyle w:val="ListParagraph"/>
+        <w:numPr>
+          <w:ilvl w:val="0"/>
+          <w:numId w:val="2"/>
+        </w:numPr>
+        <w:spacing w:after="100" w:line="288"/>
+      </w:pPr>
+      <w:r>
+        <w:rPr>
+          <w:sz w:val="22"/>
+          <w:szCs w:val="22"/>
+        </w:rPr>
+        <w:t xml:space="preserve">Latinos as the NFL's fastest-growing fan base; rising Hispanic and Spanish-language viewership: </w:t>
+      </w:r>
+      <w:hyperlink w:history="1" r:id="rIdv-bhhobospxq6ljdrunpi">
+        <w:r>
+          <w:rPr>
+            <w:rStyle w:val="Hyperlink"/>
+            <w:sz w:val="22"/>
+            <w:szCs w:val="22"/>
+          </w:rPr>
+          <w:t xml:space="preserve">NPR</w:t>
+        </w:r>
+      </w:hyperlink>
+      <w:r>
+        <w:rPr>
+          <w:sz w:val="22"/>
+          <w:szCs w:val="22"/>
+        </w:rPr>
+        <w:t xml:space="preserve"> · </w:t>
+      </w:r>
+      <w:hyperlink w:history="1" r:id="rIdvi4niivjzzcv_3eseqmfh">
+        <w:r>
+          <w:rPr>
+            <w:rStyle w:val="Hyperlink"/>
+            <w:sz w:val="22"/>
+            <w:szCs w:val="22"/>
+          </w:rPr>
+          <w:t xml:space="preserve">DIRECTV</w:t>
+        </w:r>
+      </w:hyperlink>
+    </w:p>
+    <w:p>
+      <w:pPr>
+        <w:pStyle w:val="ListParagraph"/>
+        <w:numPr>
+          <w:ilvl w:val="0"/>
+          <w:numId w:val="2"/>
+        </w:numPr>
+        <w:spacing w:after="100" w:line="288"/>
+      </w:pPr>
+      <w:r>
+        <w:rPr>
+          <w:sz w:val="22"/>
+          <w:szCs w:val="22"/>
+        </w:rPr>
+        <w:t xml:space="preserve">Miami Dolphins 2026 international watch parties (Brazil, Spain, Mexico, Argentina): </w:t>
+      </w:r>
+      <w:hyperlink w:history="1" r:id="rIdwashzriocdn4--jwsc5bn">
+        <w:r>
+          <w:rPr>
+            <w:rStyle w:val="Hyperlink"/>
+            <w:sz w:val="22"/>
+            <w:szCs w:val="22"/>
+          </w:rPr>
+          <w:t xml:space="preserve">Miami Dolphins</w:t>
+        </w:r>
+      </w:hyperlink>
+    </w:p>
+    <w:p>
+      <w:pPr>
+        <w:pStyle w:val="ListParagraph"/>
+        <w:numPr>
+          <w:ilvl w:val="0"/>
+          <w:numId w:val="2"/>
+        </w:numPr>
+        <w:spacing w:after="100" w:line="288"/>
+      </w:pPr>
+      <w:r>
+        <w:rPr>
+          <w:sz w:val="22"/>
+          <w:szCs w:val="22"/>
+        </w:rPr>
+        <w:t xml:space="preserve">"Wall Street South" finance migration to Miami (Citadel, Blackstone, Goldman; no state income tax): </w:t>
+      </w:r>
+      <w:hyperlink w:history="1" r:id="rIdcfw61ewukz2j6li8yuhsk">
+        <w:r>
+          <w:rPr>
+            <w:rStyle w:val="Hyperlink"/>
+            <w:sz w:val="22"/>
+            <w:szCs w:val="22"/>
+          </w:rPr>
+          <w:t xml:space="preserve">InvestmentNews</w:t>
+        </w:r>
+      </w:hyperlink>
+    </w:p>
+    <w:p>
+      <w:pPr>
+        <w:pStyle w:val="ListParagraph"/>
+        <w:numPr>
+          <w:ilvl w:val="0"/>
+          <w:numId w:val="2"/>
+        </w:numPr>
+        <w:spacing w:after="100" w:line="288"/>
+      </w:pPr>
+      <w:r>
+        <w:rPr>
+          <w:sz w:val="22"/>
+          <w:szCs w:val="22"/>
+        </w:rPr>
+        <w:t xml:space="preserve">2025 Official LDC U.S. Latino GDP Report (~$4T GDP; ~$4.1T purchasing power): </w:t>
+      </w:r>
+      <w:hyperlink w:history="1" r:id="rIdoqyohcr1fmxbrwmsdxbud">
+        <w:r>
+          <w:rPr>
+            <w:rStyle w:val="Hyperlink"/>
+            <w:sz w:val="22"/>
+            <w:szCs w:val="22"/>
+          </w:rPr>
+          <w:t xml:space="preserve">Latino Donor Collaborative</w:t>
         </w:r>
       </w:hyperlink>
     </w:p>

</xml_diff>

<commit_message>
Add early-season NFL wit to Santander/Miami post
Loop in the Dolphins' 0-3 start and league-low scoring (post-Tua, Hafley
era) for a self-aware "the Santander Red Zone hasn't been working
overtime" beat that pivots to the strategic point: a bank buying a market
and a decade is not timing a box score. Add a witty closing callback and
source the record (Wikipedia 2026 season, ESPN). No em dashes.

Co-Authored-By: Claude Opus 4.8 <noreply@anthropic.com>
Claude-Session: https://claude.ai/code/session_01WdmaS8fb3WHmxD5MVo6UfL
</commit_message>
<xml_diff>
--- a/blog/Santander-Miami-Dolphins-South-Florida.docx
+++ b/blog/Santander-Miami-Dolphins-South-Florida.docx
@@ -67,7 +67,7 @@
         </w:rPr>
         <w:t xml:space="preserve">On September 24, 2026, Santander announced it is </w:t>
       </w:r>
-      <w:hyperlink w:history="1" r:id="rIdk6j6yso13udq5vmiokhr6">
+      <w:hyperlink w:history="1" r:id="rIdhggswgppedreo6jtov1f9">
         <w:r>
           <w:rPr>
             <w:rStyle w:val="Hyperlink"/>
@@ -123,7 +123,7 @@
         </w:rPr>
         <w:t xml:space="preserve">The sport is not incidental to the strategy. Latinos are the </w:t>
       </w:r>
-      <w:hyperlink w:history="1" r:id="rIdt3xaqdmdwa-sk3pwzdmfv">
+      <w:hyperlink w:history="1" r:id="rId1q3y73xwxgkzvu3sg8uqj">
         <w:r>
           <w:rPr>
             <w:rStyle w:val="Hyperlink"/>
@@ -140,7 +140,7 @@
         </w:rPr>
         <w:t xml:space="preserve">, and </w:t>
       </w:r>
-      <w:hyperlink w:history="1" r:id="rIde4rbu76lioqrefusrcxvs">
+      <w:hyperlink w:history="1" r:id="rIdrigciwlkomzpwtwo-8euf">
         <w:r>
           <w:rPr>
             <w:rStyle w:val="Hyperlink"/>
@@ -157,7 +157,7 @@
         </w:rPr>
         <w:t xml:space="preserve"> across the league. The Dolphins in particular are courting exactly the countries where Santander is a household name, opening the 2026 season with </w:t>
       </w:r>
-      <w:hyperlink w:history="1" r:id="rIdztg4sieq9q9op59ka88n0">
+      <w:hyperlink w:history="1" r:id="rIdlns8ru_odnnttu6n-aoib">
         <w:r>
           <w:rPr>
             <w:rStyle w:val="Hyperlink"/>
@@ -173,6 +173,52 @@
           <w:szCs w:val="22"/>
         </w:rPr>
         <w:t xml:space="preserve">. The team's own international map and the bank's footprint line up almost perfectly.</w:t>
+      </w:r>
+    </w:p>
+    <w:p>
+      <w:pPr>
+        <w:spacing w:after="160" w:line="288"/>
+      </w:pPr>
+      <w:r>
+        <w:rPr>
+          <w:sz w:val="22"/>
+          <w:szCs w:val="22"/>
+        </w:rPr>
+        <w:t xml:space="preserve">A cheeky footnote for anyone watching the scoreboard: the Dolphins opened the season </w:t>
+      </w:r>
+      <w:hyperlink w:history="1" r:id="rIdd8mqr4aatzagblyqsdqkx">
+        <w:r>
+          <w:rPr>
+            <w:rStyle w:val="Hyperlink"/>
+            <w:sz w:val="22"/>
+            <w:szCs w:val="22"/>
+          </w:rPr>
+          <w:t xml:space="preserve">0-3</w:t>
+        </w:r>
+      </w:hyperlink>
+      <w:r>
+        <w:rPr>
+          <w:sz w:val="22"/>
+          <w:szCs w:val="22"/>
+        </w:rPr>
+        <w:t xml:space="preserve">, losing to the Raiders, 49ers, and Chiefs, and are </w:t>
+      </w:r>
+      <w:hyperlink w:history="1" r:id="rIdo9ddgvq153_pqrr5wbkif">
+        <w:r>
+          <w:rPr>
+            <w:rStyle w:val="Hyperlink"/>
+            <w:sz w:val="22"/>
+            <w:szCs w:val="22"/>
+          </w:rPr>
+          <w:t xml:space="preserve">near the bottom of the league at about 12 points a game</w:t>
+        </w:r>
+      </w:hyperlink>
+      <w:r>
+        <w:rPr>
+          <w:sz w:val="22"/>
+          <w:szCs w:val="22"/>
+        </w:rPr>
+        <w:t xml:space="preserve">, so the freshly branded Santander Red Zone has not exactly been working overtime. That is less a problem than a tell. You do not sponsor a team's red zone because you are timing this season's box score. You do it because you are buying a market and a decade, and a bank that thinks in 40-year private-banking relationships can comfortably wait out a rebuild under new head coach Jeff Hafley, even in the first season of the post-Tua Tagovailoa era.</w:t>
       </w:r>
     </w:p>
     <w:p>
@@ -201,7 +247,7 @@
         </w:rPr>
         <w:t xml:space="preserve">Miami is not just a large metro. It is the gateway to Latin America, and the demographics make the point. </w:t>
       </w:r>
-      <w:hyperlink w:history="1" r:id="rIdgjvscpgrsfzf6zv9bh5id">
+      <w:hyperlink w:history="1" r:id="rIdiplfxlegyfiqix8kpv1j6">
         <w:r>
           <w:rPr>
             <w:rStyle w:val="Hyperlink"/>
@@ -230,7 +276,7 @@
         </w:rPr>
         <w:t xml:space="preserve">Two forces amplify the opportunity. First, the money is moving south. Miami has become "Wall Street South," with </w:t>
       </w:r>
-      <w:hyperlink w:history="1" r:id="rIdqxxf1_45_0zxk2fgigj_7">
+      <w:hyperlink w:history="1" r:id="rIdwo8iesu6cou9edqoyk0vz">
         <w:r>
           <w:rPr>
             <w:rStyle w:val="Hyperlink"/>
@@ -247,7 +293,7 @@
         </w:rPr>
         <w:t xml:space="preserve">, drawn in part by Florida's lack of a state income, capital-gains, or estate tax. Much of that capital lands in Brickell, the very financial district where Santander is building its 1401 tower. Second, the customer base is not only large but rising fast: the </w:t>
       </w:r>
-      <w:hyperlink w:history="1" r:id="rIdw371cyuls14fdiudp35vv">
+      <w:hyperlink w:history="1" r:id="rIdzlw0bqld7b7v5mfde1-qc">
         <w:r>
           <w:rPr>
             <w:rStyle w:val="Hyperlink"/>
@@ -315,7 +361,7 @@
         </w:rPr>
         <w:t xml:space="preserve">And the sponsorship is only the visible tip of a deep local bet. Santander opened its </w:t>
       </w:r>
-      <w:hyperlink w:history="1" r:id="rIdohnu3s0uvr3lgtl-kyevf">
+      <w:hyperlink w:history="1" r:id="rId3scg1ato1asvcuwzpyfet">
         <w:r>
           <w:rPr>
             <w:rStyle w:val="Hyperlink"/>
@@ -332,7 +378,7 @@
         </w:rPr>
         <w:t xml:space="preserve">, broke ground on the </w:t>
       </w:r>
-      <w:hyperlink w:history="1" r:id="rIdpdrifovx-ydrmz6xdihia">
+      <w:hyperlink w:history="1" r:id="rIdpdk8zn4blcgwl-s3gai_w">
         <w:r>
           <w:rPr>
             <w:rStyle w:val="Hyperlink"/>
@@ -349,7 +395,7 @@
         </w:rPr>
         <w:t xml:space="preserve"> in the financial district, and has run a Miami private-banking hub serving the Americas for more than 40 years, part of a regional presence it traces to 1979. It even runs the same Openbank digital brand it </w:t>
       </w:r>
-      <w:hyperlink w:history="1" r:id="rIddfom_w0iojuyplmaigtdn">
+      <w:hyperlink w:history="1" r:id="rId4vhj9vx80hqsizp4z3bwo">
         <w:r>
           <w:rPr>
             <w:rStyle w:val="Hyperlink"/>
@@ -403,7 +449,7 @@
           <w:sz w:val="22"/>
           <w:szCs w:val="22"/>
         </w:rPr>
-        <w:t xml:space="preserve">The catch is the same as always. Reach and even familiarity get you noticed; they do not close the relationship. A Portuguese-dominant Brazilian family or a Spanish-first Venezuelan entrepreneur will judge Santander on whether the app, the onboarding, the disclosures, and the service actually meet them in their language once the game ends. In a market that is two-thirds Spanish-speaking and heavily Portuguese, the bank that wins is the one whose in-language experience is as strong as its brand. Santander has the trust. The follow-through is where the touchdown is scored.</w:t>
+        <w:t xml:space="preserve">The catch is the same as always. Reach and even familiarity get you noticed; they do not close the relationship. A Portuguese-dominant Brazilian family or a Spanish-first Venezuelan entrepreneur will judge Santander on whether the app, the onboarding, the disclosures, and the service actually meet them in their language once the game ends. In a market that is two-thirds Spanish-speaking and heavily Portuguese, the bank that wins is the one whose in-language experience is as strong as its brand. Santander has the trust. The follow-through is where the touchdown is scored, and unlike the home team this September, it is a drive the bank looks well equipped to finish.</w:t>
       </w:r>
     </w:p>
     <w:p>
@@ -451,7 +497,7 @@
         </w:rPr>
         <w:t xml:space="preserve"> </w:t>
       </w:r>
-      <w:hyperlink w:history="1" r:id="rIdpaa0mosrqwc2rlq61nyyr">
+      <w:hyperlink w:history="1" r:id="rId8qsjg6vgvxwggs_2ws9ck">
         <w:r>
           <w:rPr>
             <w:rStyle w:val="Hyperlink"/>
@@ -468,7 +514,7 @@
         </w:rPr>
         <w:t xml:space="preserve"> and </w:t>
       </w:r>
-      <w:hyperlink w:history="1" r:id="rIdbg5cwkydplpmbqd7vydws">
+      <w:hyperlink w:history="1" r:id="rIdovdvwgmd9gaa9k2p0t2cf">
         <w:r>
           <w:rPr>
             <w:rStyle w:val="Hyperlink"/>
@@ -544,7 +590,7 @@
         </w:rPr>
         <w:t xml:space="preserve">Santander Bank Partners with Miami Dolphins and Hard Rock Stadium as It Expands Its South Florida Presence (Sep 24, 2026): </w:t>
       </w:r>
-      <w:hyperlink w:history="1" r:id="rIdv8t3wxwn-dup3qz5mbipm">
+      <w:hyperlink w:history="1" r:id="rIdyoptgainmqup1xcopiqia">
         <w:r>
           <w:rPr>
             <w:rStyle w:val="Hyperlink"/>
@@ -561,7 +607,7 @@
         </w:rPr>
         <w:t xml:space="preserve"> · </w:t>
       </w:r>
-      <w:hyperlink w:history="1" r:id="rIdyd8syp7nverxupnqbu_re">
+      <w:hyperlink w:history="1" r:id="rIdvyr-nzixsyh-ahkeng2yj">
         <w:r>
           <w:rPr>
             <w:rStyle w:val="Hyperlink"/>
@@ -588,7 +634,7 @@
         </w:rPr>
         <w:t xml:space="preserve">Santander Introduces First Openbank Location in the United States at Miami Worldcenter (May 2025): </w:t>
       </w:r>
-      <w:hyperlink w:history="1" r:id="rIdk6xt2aylmn4-vhdac4jio">
+      <w:hyperlink w:history="1" r:id="rId_hkrz7nfald1ogvsarbyg">
         <w:r>
           <w:rPr>
             <w:rStyle w:val="Hyperlink"/>
@@ -615,7 +661,7 @@
         </w:rPr>
         <w:t xml:space="preserve">Santander Celebrates Groundbreaking of 1401 Brickell in Miami and Continued U.S. Growth: </w:t>
       </w:r>
-      <w:hyperlink w:history="1" r:id="rIdl7wcasmnisqqoilbvkz-v">
+      <w:hyperlink w:history="1" r:id="rIdk7okaftszk4knlgxwcwjk">
         <w:r>
           <w:rPr>
             <w:rStyle w:val="Hyperlink"/>
@@ -642,7 +688,7 @@
         </w:rPr>
         <w:t xml:space="preserve">Openbank launches in Mexico (Feb 2025): </w:t>
       </w:r>
-      <w:hyperlink w:history="1" r:id="rId3wveplhght9hqzukyl7yn">
+      <w:hyperlink w:history="1" r:id="rIdmjoq2tmmiqbufd_tye1q5">
         <w:r>
           <w:rPr>
             <w:rStyle w:val="Hyperlink"/>
@@ -669,7 +715,7 @@
         </w:rPr>
         <w:t xml:space="preserve">Miami as a global-first market and gateway to Latin America (~70% Hispanic): </w:t>
       </w:r>
-      <w:hyperlink w:history="1" r:id="rId8_7mdiplpuqd7p5-7-ep-">
+      <w:hyperlink w:history="1" r:id="rIdeftsmujnumgsk5sujyptk">
         <w:r>
           <w:rPr>
             <w:rStyle w:val="Hyperlink"/>
@@ -686,7 +732,7 @@
         </w:rPr>
         <w:t xml:space="preserve"> · </w:t>
       </w:r>
-      <w:hyperlink w:history="1" r:id="rId7v70fiswchg23sleii1sa">
+      <w:hyperlink w:history="1" r:id="rId9afx12ulqoxkiqie2biho">
         <w:r>
           <w:rPr>
             <w:rStyle w:val="Hyperlink"/>
@@ -713,7 +759,7 @@
         </w:rPr>
         <w:t xml:space="preserve">Latinos as the NFL's fastest-growing fan base; rising Hispanic and Spanish-language viewership: </w:t>
       </w:r>
-      <w:hyperlink w:history="1" r:id="rIdv-bhhobospxq6ljdrunpi">
+      <w:hyperlink w:history="1" r:id="rId_xktdzrzdhawbjqajdffl">
         <w:r>
           <w:rPr>
             <w:rStyle w:val="Hyperlink"/>
@@ -730,7 +776,7 @@
         </w:rPr>
         <w:t xml:space="preserve"> · </w:t>
       </w:r>
-      <w:hyperlink w:history="1" r:id="rIdvi4niivjzzcv_3eseqmfh">
+      <w:hyperlink w:history="1" r:id="rId3ukxnmthijv1mxomezbbi">
         <w:r>
           <w:rPr>
             <w:rStyle w:val="Hyperlink"/>
@@ -757,7 +803,7 @@
         </w:rPr>
         <w:t xml:space="preserve">Miami Dolphins 2026 international watch parties (Brazil, Spain, Mexico, Argentina): </w:t>
       </w:r>
-      <w:hyperlink w:history="1" r:id="rIdwashzriocdn4--jwsc5bn">
+      <w:hyperlink w:history="1" r:id="rId1oe2ixjwydyg6vlhpkydc">
         <w:r>
           <w:rPr>
             <w:rStyle w:val="Hyperlink"/>
@@ -784,7 +830,7 @@
         </w:rPr>
         <w:t xml:space="preserve">"Wall Street South" finance migration to Miami (Citadel, Blackstone, Goldman; no state income tax): </w:t>
       </w:r>
-      <w:hyperlink w:history="1" r:id="rIdcfw61ewukz2j6li8yuhsk">
+      <w:hyperlink w:history="1" r:id="rIdazmnku5glfdcbw8je-wxm">
         <w:r>
           <w:rPr>
             <w:rStyle w:val="Hyperlink"/>
@@ -811,7 +857,7 @@
         </w:rPr>
         <w:t xml:space="preserve">2025 Official LDC U.S. Latino GDP Report (~$4T GDP; ~$4.1T purchasing power): </w:t>
       </w:r>
-      <w:hyperlink w:history="1" r:id="rIdoqyohcr1fmxbrwmsdxbud">
+      <w:hyperlink w:history="1" r:id="rIdhbec4ypq5uvo-zlmkwbq1">
         <w:r>
           <w:rPr>
             <w:rStyle w:val="Hyperlink"/>
@@ -819,6 +865,50 @@
             <w:szCs w:val="22"/>
           </w:rPr>
           <w:t xml:space="preserve">Latino Donor Collaborative</w:t>
+        </w:r>
+      </w:hyperlink>
+    </w:p>
+    <w:p>
+      <w:pPr>
+        <w:pStyle w:val="ListParagraph"/>
+        <w:numPr>
+          <w:ilvl w:val="0"/>
+          <w:numId w:val="2"/>
+        </w:numPr>
+        <w:spacing w:after="100" w:line="288"/>
+      </w:pPr>
+      <w:r>
+        <w:rPr>
+          <w:sz w:val="22"/>
+          <w:szCs w:val="22"/>
+        </w:rPr>
+        <w:t xml:space="preserve">Miami Dolphins 2026 season (0-3 start; scoring near the bottom of the league; post-Tua, Hafley era): </w:t>
+      </w:r>
+      <w:hyperlink w:history="1" r:id="rId9jx0t5_cmbmhbqlxlwoos">
+        <w:r>
+          <w:rPr>
+            <w:rStyle w:val="Hyperlink"/>
+            <w:sz w:val="22"/>
+            <w:szCs w:val="22"/>
+          </w:rPr>
+          <w:t xml:space="preserve">2026 Miami Dolphins season</w:t>
+        </w:r>
+      </w:hyperlink>
+      <w:r>
+        <w:rPr>
+          <w:sz w:val="22"/>
+          <w:szCs w:val="22"/>
+        </w:rPr>
+        <w:t xml:space="preserve"> · </w:t>
+      </w:r>
+      <w:hyperlink w:history="1" r:id="rIdx8ib_5eklfsjshkyltexw">
+        <w:r>
+          <w:rPr>
+            <w:rStyle w:val="Hyperlink"/>
+            <w:sz w:val="22"/>
+            <w:szCs w:val="22"/>
+          </w:rPr>
+          <w:t xml:space="preserve">ESPN team stats</w:t>
         </w:r>
       </w:hyperlink>
     </w:p>

</xml_diff>